<commit_message>
v86 JIK: apply the independent KO-EN review, finish the delivery set
Meaning-level fixes in both languages: the phase summaries in the
abstract, 5.2 and the conclusion now refer to the integrated share (the
count kept rising); 6.2 says "most frequent" instead of "mostly"; 5.4
scopes the clustering, control-model and RQ1 summary sentences to what
the tables show; the 5.2 year-coefficient sentence is split and sourced
to Table C1; 6.3 names the truncation; 2.3 uses the measured category
(processing apparatus). Highlights 2 and 5 reworded. English polish in
sections 2-6, captions and Table 1. Summary of the v86 changes added to
condense_v86_ko. All builds FAILS 0; abstract 250 words; KO 33 pages,
EN 37 pages.

Co-Authored-By: Claude Opus 5.5 <noreply@anthropic.com>
Claude-Session: https://claude.ai/code/session_01SvckvZxt3hAXTDPnm8YPEC
</commit_message>
<xml_diff>
--- a/journal/highlights_v86_en_JIK.docx
+++ b/journal/highlights_v86_en_JIK.docx
@@ -32,7 +32,7 @@
         </w:numPr>
       </w:pPr>
       <w:r>
-        <w:t xml:space="preserve">Inventions integrating bonding and fabrication knowledge formed the largest group</w:t>
+        <w:t xml:space="preserve">Nearly half of the applications integrated bonding and fabrication knowledge</w:t>
       </w:r>
     </w:p>
     <w:p>
@@ -68,7 +68,7 @@
         </w:numPr>
       </w:pPr>
       <w:r>
-        <w:t xml:space="preserve">As the core design matured, integration moved from the core to peripheral processes</w:t>
+        <w:t xml:space="preserve">As the core design became entrenched, integration shifted to peripheral processes</w:t>
       </w:r>
     </w:p>
     <w:bookmarkEnd w:id="9"/>

</xml_diff>